<commit_message>
Apply decision B on prompt length: confound stated throughout; hedge knowledge claims; add Hu & Wang, Feng & Li; coder C independence and codebook review
Co-Authored-By: Claude Opus 5.5 <noreply@anthropic.com>
Claude-Session: https://claude.ai/code/session_01GB8Rfzg6X7AHVt7uPTpp3b
</commit_message>
<xml_diff>
--- a/research/sci-publication-plan/p1/submission/cover_letter.docx
+++ b/research/sci-publication-plan/p1/submission/cover_letter.docx
@@ -51,7 +51,23 @@
         <w:pStyle w:val="BodyText"/>
       </w:pPr>
       <w:r>
-        <w:t xml:space="preserve">Generative image tools have entered fashion and stage costume design, and knowing which garment, colour and accessory belong to which wearer is part of the professional knowledge these tools are meant to support. The manuscript tests that knowledge against a written standard, the dress code of Peking opera. I generated 144 images of eight canonical roles in three channels (Doubao, Meta AI and Hunyuan Image Alpha), with and without the dress code stated in the prompt, and coded each image on six dimensions. The images were coded independently by me and by a large language model, and disagreements were adjudicated under logged rules. To my knowledge, this is the first audit of generated opera costume against the dress code itself.</w:t>
+        <w:t xml:space="preserve">The Journal has recently published digital studies of traditional dress, such as Feng and Li’s (2026) heritage colour database for the</w:t>
+      </w:r>
+      <w:r>
+        <w:t xml:space="preserve"> </w:t>
+      </w:r>
+      <w:r>
+        <w:rPr>
+          <w:iCs/>
+          <w:i/>
+        </w:rPr>
+        <w:t xml:space="preserve">yunjian</w:t>
+      </w:r>
+      <w:r>
+        <w:t xml:space="preserve"> </w:t>
+      </w:r>
+      <w:r>
+        <w:t xml:space="preserve">cloud collar, and this manuscript adds an evaluation of generative tools to that line of work. Generative image tools have entered fashion and stage costume design, and knowing which garment, colour and accessory belong to which wearer is part of the professional knowledge these tools are meant to support. The manuscript tests that knowledge against a written standard, the dress code of Peking opera. I generated 144 images of eight canonical roles in three channels (Doubao, Meta AI and Hunyuan Image Alpha), with and without the dress code stated in the prompt, and coded each image on six dimensions. The images were coded independently by me and by a large language model, and disagreements were adjudicated under logged rules. To my knowledge, this is the first audit that takes a written costume dress code as the standard and checks generated images against it item by item, under prompts with and without the code.</w:t>
       </w:r>
     </w:p>
     <w:p>
@@ -59,7 +75,7 @@
         <w:pStyle w:val="BodyText"/>
       </w:pPr>
       <w:r>
-        <w:t xml:space="preserve">Only 56 of the 144 images were fully compliant, and violations concentrated in headwear and small identifying markers. Stating the dress code reduced the odds of a violation sharply (OR 0.066), but did not remove errors: two thirds of the images from one channel still broke at least one rule. The study also provides a reusable codebook, and the data, codes and analysis scripts are available to reviewers through an anonymised OSF link.</w:t>
+        <w:t xml:space="preserve">Only 56 of the 144 images were fully compliant, and violations concentrated in headwear and small identifying markers. Under the prompt that stated the dress code the odds of a violation were far lower (OR 0.066), an effect that cannot be separated from the prompt’s greater length, and errors remained: two thirds of the images from one channel still broke at least one rule. The study also provides a reusable codebook, and the data, codes and analysis scripts are available to reviewers through an anonymised OSF link.</w:t>
       </w:r>
     </w:p>
     <w:p>
@@ -67,7 +83,7 @@
         <w:pStyle w:val="BodyText"/>
       </w:pPr>
       <w:r>
-        <w:t xml:space="preserve">The manuscript has not been published and is not under consideration by any other journal. I have no competing interests to declare. The use of generative AI in preparing the manuscript is described in the declarations section.</w:t>
+        <w:t xml:space="preserve">The manuscript has not been published and is not under consideration by any other journal. A related study of mine, which applies a similar prompt comparison to Chinese and Korean architectural painting, is under review at another journal; it uses different objects, images and data. I have no competing interests to declare. The use of generative AI in preparing the manuscript is described in the declarations section.</w:t>
       </w:r>
     </w:p>
     <w:p>

</xml_diff>